<commit_message>
Say where the class lists and curriculum format came from
Class lists were exported from the KSU MIS in the format the program
chairpersons provided; the curriculum import format was designed by the
group. Drops the review comment that asked about this.

Co-Authored-By: Claude Opus 5.5 <noreply@anthropic.com>
Claude-Session: https://claude.ai/code/session_01MN4gTfErSULVtFJnUJ6zoR
</commit_message>
<xml_diff>
--- a/docs/paper/Auditrix_with_UI - clean.docx
+++ b/docs/paper/Auditrix_with_UI - clean.docx
@@ -6893,7 +6893,6 @@
           <w:lang w:val="en-US"/>
         </w:rPr>
       </w:pPr>
-      <w:commentRangeStart w:id="3"/>
       <w:r>
         <w:rPr>
           <w:rFonts w:ascii="Courier New" w:hAnsi="Courier New" w:cs="Courier New"/>
@@ -6910,7 +6909,7 @@
           <w:szCs w:val="24"/>
           <w:lang w:val="en-US"/>
         </w:rPr>
-        <w:t xml:space="preserve">student lists exported</w:t>
+        <w:t xml:space="preserve">class lists exported</w:t>
       </w:r>
       <w:r>
         <w:rPr>
@@ -6928,7 +6927,7 @@
           <w:szCs w:val="24"/>
           <w:lang w:val="en-US"/>
         </w:rPr>
-        <w:t xml:space="preserve"> in its "Export to Excel" format</w:t>
+        <w:t xml:space="preserve">, in the format provided by the Program Chairpersons. The format for importing curricula was designed by the researchers</w:t>
       </w:r>
       <w:r>
         <w:rPr>
@@ -6938,13 +6937,6 @@
           <w:lang w:val="en-US"/>
         </w:rPr>
         <w:t xml:space="preserve">. By synthesizing the qualitative insights from these participants with the quantitative benchmarks found in existing institutional literature and automated academic auditing records, the researchers established a comprehensive data foundation for the development and evaluation of the proposed system.</w:t>
-      </w:r>
-      <w:commentRangeEnd w:id="3"/>
-      <w:r>
-        <w:rPr>
-          <w:rStyle w:val="CommentReference"/>
-        </w:rPr>
-        <w:commentReference w:id="3"/>
       </w:r>
     </w:p>
     <w:p>
@@ -9486,7 +9478,7 @@
           <w:sz w:val="24"/>
           <w:szCs w:val="24"/>
         </w:rPr>
-        <w:t xml:space="preserve"> Each program keeps curriculum versions by effective year (e.g., BSCpE 2019 and 2023), and a new version can copy an existing one. Each subject has a code, title, units, year level and semester (including midyear), and its requirements. Curricula can be imported from a CSV or .xls file with a preview of what will be added, changed or removed before saving, exported to CSV or PDF, and every change is kept in a per-version change history showing who changed what, and when.</w:t>
+        <w:t xml:space="preserve"> Each program keeps curriculum versions by effective year (e.g., BSCpE 2019 and 2023), and a new version can copy an existing one. Each subject has a code, title, units, year level and semester (including midyear), and its requirements. Curricula can be imported from a CSV or .xls file, in a format designed by the researchers, with a preview of what will be added, changed or removed before saving, exported to CSV or PDF, and every change is kept in a per-version change history showing who changed what, and when.</w:t>
       </w:r>
     </w:p>
     <w:p>
@@ -9516,7 +9508,7 @@
           <w:sz w:val="24"/>
           <w:szCs w:val="24"/>
         </w:rPr>
-        <w:t xml:space="preserve"> Students are registered one at a time or imported from a CSV or .xls file, either the system's template or the student list produced by the KSU-MIS "Export to Excel" function, and ID numbers are checked against the KSU format (e.g., 24-113792). When a student shifts, the releasing chairperson files a shift request and the receiving program's chairperson accepts the student into one of their curriculum versions. Transfers in and out and drops are recorded as well, and every movement is kept in the student's history.</w:t>
+        <w:t xml:space="preserve"> Students are registered one at a time or imported from a CSV or .xls file, either the system's template or a class list exported from the KSU MIS (its "Export to Excel" file, in the format the Program Chairpersons provided), and ID numbers are checked against the KSU format (e.g., 24-113792). When a student shifts, the releasing chairperson files a shift request and the receiving program's chairperson accepts the student into one of their curriculum versions. Transfers in and out and drops are recorded as well, and every movement is kept in the student's history.</w:t>
       </w:r>
     </w:p>
     <w:p>
@@ -14721,7 +14713,7 @@
           <w:szCs w:val="24"/>
         </w:rPr>
       </w:pPr>
-      <w:commentRangeStart w:id="5"/>
+      <w:commentRangeStart w:id="4"/>
       <w:r>
         <w:rPr>
           <w:rFonts w:ascii="Courier New" w:hAnsi="Courier New" w:cs="Courier New"/>
@@ -14762,12 +14754,12 @@
         </w:rPr>
         <w:t xml:space="preserve">.)</w:t>
       </w:r>
-      <w:commentRangeEnd w:id="5"/>
+      <w:commentRangeEnd w:id="4"/>
       <w:r>
         <w:rPr>
           <w:rStyle w:val="CommentReference"/>
         </w:rPr>
-        <w:commentReference w:id="5"/>
+        <w:commentReference w:id="4"/>
       </w:r>
     </w:p>
     <w:p>
@@ -17550,7 +17542,7 @@
           <w:szCs w:val="24"/>
         </w:rPr>
       </w:pPr>
-      <w:commentRangeStart w:id="4"/>
+      <w:commentRangeStart w:id="3"/>
       <w:r>
         <w:rPr>
           <w:rFonts w:ascii="Courier New" w:hAnsi="Courier New" w:cs="Courier New"/>
@@ -17571,12 +17563,12 @@
         </w:rPr>
         <w:t xml:space="preserve"> Operations manual: Student development services &amp; placement guide. Kalinga State University.</w:t>
       </w:r>
-      <w:commentRangeEnd w:id="4"/>
+      <w:commentRangeEnd w:id="3"/>
       <w:r>
         <w:rPr>
           <w:rStyle w:val="CommentReference"/>
         </w:rPr>
-        <w:commentReference w:id="4"/>
+        <w:commentReference w:id="3"/>
       </w:r>
     </w:p>
     <w:p>
@@ -17706,7 +17698,7 @@
 
 <file path=word/comments.xml><?xml version="1.0" encoding="utf-8"?>
 <w:comments xmlns:wpc="http://schemas.microsoft.com/office/word/2010/wordprocessingCanvas" xmlns:cx="http://schemas.microsoft.com/office/drawing/2014/chartex" xmlns:cx1="http://schemas.microsoft.com/office/drawing/2015/9/8/chartex" xmlns:cx2="http://schemas.microsoft.com/office/drawing/2015/10/21/chartex" xmlns:cx3="http://schemas.microsoft.com/office/drawing/2016/5/9/chartex" xmlns:cx4="http://schemas.microsoft.com/office/drawing/2016/5/10/chartex" xmlns:cx5="http://schemas.microsoft.com/office/drawing/2016/5/11/chartex" xmlns:cx6="http://schemas.microsoft.com/office/drawing/2016/5/12/chartex" xmlns:cx7="http://schemas.microsoft.com/office/drawing/2016/5/13/chartex" xmlns:cx8="http://schemas.microsoft.com/office/drawing/2016/5/14/chartex" xmlns:mc="http://schemas.openxmlformats.org/markup-compatibility/2006" xmlns:aink="http://schemas.microsoft.com/office/drawing/2016/ink" xmlns:am3d="http://schemas.microsoft.com/office/drawing/2017/model3d" xmlns:o="urn:schemas-microsoft-com:office:office" xmlns:oel="http://schemas.microsoft.com/office/2019/extlst" xmlns:r="http://schemas.openxmlformats.org/officeDocument/2006/relationships" xmlns:m="http://schemas.openxmlformats.org/officeDocument/2006/math" xmlns:v="urn:schemas-microsoft-com:vml" xmlns:wp14="http://schemas.microsoft.com/office/word/2010/wordprocessingDrawing" xmlns:wp="http://schemas.openxmlformats.org/drawingml/2006/wordprocessingDrawing" xmlns:w10="urn:schemas-microsoft-com:office:word" xmlns:w="http://schemas.openxmlformats.org/wordprocessingml/2006/main" xmlns:w14="http://schemas.microsoft.com/office/word/2010/wordml" xmlns:w15="http://schemas.microsoft.com/office/word/2012/wordml" xmlns:w16cex="http://schemas.microsoft.com/office/word/2018/wordml/cex" xmlns:w16cid="http://schemas.microsoft.com/office/word/2016/wordml/cid" xmlns:w16="http://schemas.microsoft.com/office/word/2018/wordml" xmlns:w16du="http://schemas.microsoft.com/office/word/2023/wordml/word16du" xmlns:w16sdtdh="http://schemas.microsoft.com/office/word/2020/wordml/sdtdatahash" xmlns:w16sdtfl="http://schemas.microsoft.com/office/word/2024/wordml/sdtformatlock" xmlns:w16se="http://schemas.microsoft.com/office/word/2015/wordml/symex" xmlns:wpg="http://schemas.microsoft.com/office/word/2010/wordprocessingGroup" xmlns:wpi="http://schemas.microsoft.com/office/word/2010/wordprocessingInk" xmlns:wne="http://schemas.microsoft.com/office/word/2006/wordml" xmlns:wps="http://schemas.microsoft.com/office/word/2010/wordprocessingShape" mc:Ignorable="w14 w15 w16se w16cid w16 w16cex w16sdtdh w16sdtfl w16du wp14">
-  <w:comment w:id="0" w:author="Claude" w:date="2026-10-07T12:30:20Z" w:initials="CL">
+  <w:comment w:id="0" w:author="Claude" w:date="2026-10-07T13:26:11Z" w:initials="CL">
     <w:p>
       <w:r>
         <w:rPr>
@@ -17724,7 +17716,7 @@
       </w:r>
     </w:p>
   </w:comment>
-  <w:comment w:id="1" w:author="Claude" w:date="2026-10-07T12:30:20Z" w:initials="CL">
+  <w:comment w:id="1" w:author="Claude" w:date="2026-10-07T13:26:11Z" w:initials="CL">
     <w:p>
       <w:r>
         <w:rPr>
@@ -17742,7 +17734,7 @@
       </w:r>
     </w:p>
   </w:comment>
-  <w:comment w:id="2" w:author="Claude" w:date="2026-10-07T12:30:20Z" w:initials="CL">
+  <w:comment w:id="2" w:author="Claude" w:date="2026-10-07T13:26:11Z" w:initials="CL">
     <w:p>
       <w:r>
         <w:rPr>
@@ -17760,7 +17752,7 @@
       </w:r>
     </w:p>
   </w:comment>
-  <w:comment w:id="3" w:author="Claude" w:date="2026-10-07T12:30:20Z" w:initials="CL">
+  <w:comment w:id="3" w:author="Claude" w:date="2026-10-07T13:26:11Z" w:initials="CL">
     <w:p>
       <w:r>
         <w:rPr>
@@ -17774,29 +17766,11 @@
           <w:sz w:val="20"/>
           <w:szCs w:val="20"/>
         </w:rPr>
-        <w:t xml:space="preserve">Please confirm you worked from an actual KSU-MIS export file. If not, reject this change.</w:t>
+        <w:t xml:space="preserve">Add the year or edition of the Student Handbook and Operations Manual you used, and order these with the rest of your references.</w:t>
       </w:r>
     </w:p>
   </w:comment>
-  <w:comment w:id="4" w:author="Claude" w:date="2026-10-07T12:30:21Z" w:initials="CL">
-    <w:p>
-      <w:r>
-        <w:rPr>
-          <w:rStyle w:val="CommentReference"/>
-        </w:rPr>
-        <w:annotationRef/>
-      </w:r>
-      <w:r>
-        <w:rPr>
-          <w:color w:val="000000"/>
-          <w:sz w:val="20"/>
-          <w:szCs w:val="20"/>
-        </w:rPr>
-        <w:t xml:space="preserve">Add the year or edition of the Student Handbook and Operations Manual you used, and order these with the rest of your references.</w:t>
-      </w:r>
-    </w:p>
-  </w:comment>
-  <w:comment w:id="5" w:author="Claude" w:date="2026-10-07T12:30:21Z" w:initials="CL">
+  <w:comment w:id="4" w:author="Claude" w:date="2026-10-07T13:26:11Z" w:initials="CL">
     <w:p>
       <w:r>
         <w:rPr>
@@ -17819,34 +17793,31 @@
 
 <file path=word/commentsExtended.xml><?xml version="1.0" encoding="utf-8"?>
 <w15:commentsEx xmlns:wpc="http://schemas.microsoft.com/office/word/2010/wordprocessingCanvas" xmlns:cx="http://schemas.microsoft.com/office/drawing/2014/chartex" xmlns:cx1="http://schemas.microsoft.com/office/drawing/2015/9/8/chartex" xmlns:cx2="http://schemas.microsoft.com/office/drawing/2015/10/21/chartex" xmlns:cx3="http://schemas.microsoft.com/office/drawing/2016/5/9/chartex" xmlns:cx4="http://schemas.microsoft.com/office/drawing/2016/5/10/chartex" xmlns:cx5="http://schemas.microsoft.com/office/drawing/2016/5/11/chartex" xmlns:cx6="http://schemas.microsoft.com/office/drawing/2016/5/12/chartex" xmlns:cx7="http://schemas.microsoft.com/office/drawing/2016/5/13/chartex" xmlns:cx8="http://schemas.microsoft.com/office/drawing/2016/5/14/chartex" xmlns:mc="http://schemas.openxmlformats.org/markup-compatibility/2006" xmlns:aink="http://schemas.microsoft.com/office/drawing/2016/ink" xmlns:am3d="http://schemas.microsoft.com/office/drawing/2017/model3d" xmlns:o="urn:schemas-microsoft-com:office:office" xmlns:oel="http://schemas.microsoft.com/office/2019/extlst" xmlns:r="http://schemas.openxmlformats.org/officeDocument/2006/relationships" xmlns:m="http://schemas.openxmlformats.org/officeDocument/2006/math" xmlns:v="urn:schemas-microsoft-com:vml" xmlns:wp14="http://schemas.microsoft.com/office/word/2010/wordprocessingDrawing" xmlns:wp="http://schemas.openxmlformats.org/drawingml/2006/wordprocessingDrawing" xmlns:w10="urn:schemas-microsoft-com:office:word" xmlns:w="http://schemas.openxmlformats.org/wordprocessingml/2006/main" xmlns:w14="http://schemas.microsoft.com/office/word/2010/wordml" xmlns:w15="http://schemas.microsoft.com/office/word/2012/wordml" xmlns:w16cex="http://schemas.microsoft.com/office/word/2018/wordml/cex" xmlns:w16cid="http://schemas.microsoft.com/office/word/2016/wordml/cid" xmlns:w16="http://schemas.microsoft.com/office/word/2018/wordml" xmlns:w16du="http://schemas.microsoft.com/office/word/2023/wordml/word16du" xmlns:w16sdtdh="http://schemas.microsoft.com/office/word/2020/wordml/sdtdatahash" xmlns:w16sdtfl="http://schemas.microsoft.com/office/word/2024/wordml/sdtformatlock" xmlns:w16se="http://schemas.microsoft.com/office/word/2015/wordml/symex" xmlns:wpg="http://schemas.microsoft.com/office/word/2010/wordprocessingGroup" xmlns:wpi="http://schemas.microsoft.com/office/word/2010/wordprocessingInk" xmlns:wne="http://schemas.microsoft.com/office/word/2006/wordml" xmlns:wps="http://schemas.microsoft.com/office/word/2010/wordprocessingShape" mc:Ignorable="w14 w15 w16se w16cid w16 w16cex w16sdtdh w16sdtfl w16du wp14">
-  <w15:commentEx w15:paraId="5A632343" w15:done="0"/>
-  <w15:commentEx w15:paraId="096BDA6B" w15:done="0"/>
-  <w15:commentEx w15:paraId="022F5D23" w15:done="0"/>
-  <w15:commentEx w15:paraId="5247CB42" w15:done="0"/>
-  <w15:commentEx w15:paraId="3B338548" w15:done="0"/>
-  <w15:commentEx w15:paraId="6463E24E" w15:done="0"/>
+  <w15:commentEx w15:paraId="30896CA2" w15:done="0"/>
+  <w15:commentEx w15:paraId="4815F1B7" w15:done="0"/>
+  <w15:commentEx w15:paraId="2A9007E6" w15:done="0"/>
+  <w15:commentEx w15:paraId="791627FF" w15:done="0"/>
+  <w15:commentEx w15:paraId="54613752" w15:done="0"/>
 </w15:commentsEx>
 </file>
 
 <file path=word/commentsExtensible.xml><?xml version="1.0" encoding="utf-8"?>
 <w16cex:commentsExtensible xmlns:wpc="http://schemas.microsoft.com/office/word/2010/wordprocessingCanvas" xmlns:cx="http://schemas.microsoft.com/office/drawing/2014/chartex" xmlns:cx1="http://schemas.microsoft.com/office/drawing/2015/9/8/chartex" xmlns:cx2="http://schemas.microsoft.com/office/drawing/2015/10/21/chartex" xmlns:cx3="http://schemas.microsoft.com/office/drawing/2016/5/9/chartex" xmlns:cx4="http://schemas.microsoft.com/office/drawing/2016/5/10/chartex" xmlns:cx5="http://schemas.microsoft.com/office/drawing/2016/5/11/chartex" xmlns:cx6="http://schemas.microsoft.com/office/drawing/2016/5/12/chartex" xmlns:cx7="http://schemas.microsoft.com/office/drawing/2016/5/13/chartex" xmlns:cx8="http://schemas.microsoft.com/office/drawing/2016/5/14/chartex" xmlns:mc="http://schemas.openxmlformats.org/markup-compatibility/2006" xmlns:aink="http://schemas.microsoft.com/office/drawing/2016/ink" xmlns:am3d="http://schemas.microsoft.com/office/drawing/2017/model3d" xmlns:o="urn:schemas-microsoft-com:office:office" xmlns:oel="http://schemas.microsoft.com/office/2019/extlst" xmlns:r="http://schemas.openxmlformats.org/officeDocument/2006/relationships" xmlns:m="http://schemas.openxmlformats.org/officeDocument/2006/math" xmlns:v="urn:schemas-microsoft-com:vml" xmlns:wp14="http://schemas.microsoft.com/office/word/2010/wordprocessingDrawing" xmlns:wp="http://schemas.openxmlformats.org/drawingml/2006/wordprocessingDrawing" xmlns:w10="urn:schemas-microsoft-com:office:word" xmlns:w="http://schemas.openxmlformats.org/wordprocessingml/2006/main" xmlns:w14="http://schemas.microsoft.com/office/word/2010/wordml" xmlns:w15="http://schemas.microsoft.com/office/word/2012/wordml" xmlns:w16cex="http://schemas.microsoft.com/office/word/2018/wordml/cex" xmlns:w16cid="http://schemas.microsoft.com/office/word/2016/wordml/cid" xmlns:w16="http://schemas.microsoft.com/office/word/2018/wordml" xmlns:w16du="http://schemas.microsoft.com/office/word/2023/wordml/word16du" xmlns:w16sdtdh="http://schemas.microsoft.com/office/word/2020/wordml/sdtdatahash" xmlns:w16sdtfl="http://schemas.microsoft.com/office/word/2024/wordml/sdtformatlock" xmlns:w16se="http://schemas.microsoft.com/office/word/2015/wordml/symex" xmlns:wpg="http://schemas.microsoft.com/office/word/2010/wordprocessingGroup" xmlns:wpi="http://schemas.microsoft.com/office/word/2010/wordprocessingInk" xmlns:wne="http://schemas.microsoft.com/office/word/2006/wordml" xmlns:wps="http://schemas.microsoft.com/office/word/2010/wordprocessingShape" xmlns:cr="http://schemas.microsoft.com/office/comments/2020/reactions" mc:Ignorable="w14 w15 w16se w16cid w16 w16cex w16sdtdh w16sdtfl cr w16du wp14">
-  <w16cex:commentExtensible w16cex:durableId="180BE09B" w16cex:dateUtc="2026-10-07T12:30:20Z"/>
-  <w16cex:commentExtensible w16cex:durableId="301907DC" w16cex:dateUtc="2026-10-07T12:30:20Z"/>
-  <w16cex:commentExtensible w16cex:durableId="6AA4B674" w16cex:dateUtc="2026-10-07T12:30:20Z"/>
-  <w16cex:commentExtensible w16cex:durableId="28088463" w16cex:dateUtc="2026-10-07T12:30:20Z"/>
-  <w16cex:commentExtensible w16cex:durableId="4662B79D" w16cex:dateUtc="2026-10-07T12:30:21Z"/>
-  <w16cex:commentExtensible w16cex:durableId="4762062F" w16cex:dateUtc="2026-10-07T12:30:21Z"/>
+  <w16cex:commentExtensible w16cex:durableId="2D6A9B33" w16cex:dateUtc="2026-10-07T13:26:11Z"/>
+  <w16cex:commentExtensible w16cex:durableId="2B9EF915" w16cex:dateUtc="2026-10-07T13:26:11Z"/>
+  <w16cex:commentExtensible w16cex:durableId="0599AB21" w16cex:dateUtc="2026-10-07T13:26:11Z"/>
+  <w16cex:commentExtensible w16cex:durableId="58E81288" w16cex:dateUtc="2026-10-07T13:26:11Z"/>
+  <w16cex:commentExtensible w16cex:durableId="2FD77DF2" w16cex:dateUtc="2026-10-07T13:26:11Z"/>
 </w16cex:commentsExtensible>
 </file>
 
 <file path=word/commentsIds.xml><?xml version="1.0" encoding="utf-8"?>
 <w16cid:commentsIds xmlns:wpc="http://schemas.microsoft.com/office/word/2010/wordprocessingCanvas" xmlns:cx="http://schemas.microsoft.com/office/drawing/2014/chartex" xmlns:cx1="http://schemas.microsoft.com/office/drawing/2015/9/8/chartex" xmlns:cx2="http://schemas.microsoft.com/office/drawing/2015/10/21/chartex" xmlns:cx3="http://schemas.microsoft.com/office/drawing/2016/5/9/chartex" xmlns:cx4="http://schemas.microsoft.com/office/drawing/2016/5/10/chartex" xmlns:cx5="http://schemas.microsoft.com/office/drawing/2016/5/11/chartex" xmlns:cx6="http://schemas.microsoft.com/office/drawing/2016/5/12/chartex" xmlns:cx7="http://schemas.microsoft.com/office/drawing/2016/5/13/chartex" xmlns:cx8="http://schemas.microsoft.com/office/drawing/2016/5/14/chartex" xmlns:mc="http://schemas.openxmlformats.org/markup-compatibility/2006" xmlns:aink="http://schemas.microsoft.com/office/drawing/2016/ink" xmlns:am3d="http://schemas.microsoft.com/office/drawing/2017/model3d" xmlns:o="urn:schemas-microsoft-com:office:office" xmlns:oel="http://schemas.microsoft.com/office/2019/extlst" xmlns:r="http://schemas.openxmlformats.org/officeDocument/2006/relationships" xmlns:m="http://schemas.openxmlformats.org/officeDocument/2006/math" xmlns:v="urn:schemas-microsoft-com:vml" xmlns:wp14="http://schemas.microsoft.com/office/word/2010/wordprocessingDrawing" xmlns:wp="http://schemas.openxmlformats.org/drawingml/2006/wordprocessingDrawing" xmlns:w10="urn:schemas-microsoft-com:office:word" xmlns:w="http://schemas.openxmlformats.org/wordprocessingml/2006/main" xmlns:w14="http://schemas.microsoft.com/office/word/2010/wordml" xmlns:w15="http://schemas.microsoft.com/office/word/2012/wordml" xmlns:w16cex="http://schemas.microsoft.com/office/word/2018/wordml/cex" xmlns:w16cid="http://schemas.microsoft.com/office/word/2016/wordml/cid" xmlns:w16="http://schemas.microsoft.com/office/word/2018/wordml" xmlns:w16du="http://schemas.microsoft.com/office/word/2023/wordml/word16du" xmlns:w16sdtdh="http://schemas.microsoft.com/office/word/2020/wordml/sdtdatahash" xmlns:w16sdtfl="http://schemas.microsoft.com/office/word/2024/wordml/sdtformatlock" xmlns:w16se="http://schemas.microsoft.com/office/word/2015/wordml/symex" xmlns:wpg="http://schemas.microsoft.com/office/word/2010/wordprocessingGroup" xmlns:wpi="http://schemas.microsoft.com/office/word/2010/wordprocessingInk" xmlns:wne="http://schemas.microsoft.com/office/word/2006/wordml" xmlns:wps="http://schemas.microsoft.com/office/word/2010/wordprocessingShape" mc:Ignorable="w14 w15 w16se w16cid w16 w16cex w16sdtdh w16sdtfl w16du wp14">
-  <w16cid:commentId w16cid:paraId="5A632343" w16cid:durableId="180BE09B"/>
-  <w16cid:commentId w16cid:paraId="096BDA6B" w16cid:durableId="301907DC"/>
-  <w16cid:commentId w16cid:paraId="022F5D23" w16cid:durableId="6AA4B674"/>
-  <w16cid:commentId w16cid:paraId="5247CB42" w16cid:durableId="28088463"/>
-  <w16cid:commentId w16cid:paraId="3B338548" w16cid:durableId="4662B79D"/>
-  <w16cid:commentId w16cid:paraId="6463E24E" w16cid:durableId="4762062F"/>
+  <w16cid:commentId w16cid:paraId="30896CA2" w16cid:durableId="2D6A9B33"/>
+  <w16cid:commentId w16cid:paraId="4815F1B7" w16cid:durableId="2B9EF915"/>
+  <w16cid:commentId w16cid:paraId="2A9007E6" w16cid:durableId="0599AB21"/>
+  <w16cid:commentId w16cid:paraId="791627FF" w16cid:durableId="58E81288"/>
+  <w16cid:commentId w16cid:paraId="54613752" w16cid:durableId="2FD77DF2"/>
 </w16cid:commentsIds>
 </file>
 

</xml_diff>

<commit_message>
Add the Create Program and first-login screenshots to the paper
Figure 4.7k is the new Create Program screen and 4.7l the first-login
password change; the later screenshots move down one letter. No
screenshot placeholders remain.

Co-Authored-By: Claude Opus 5.5 <noreply@anthropic.com>
Claude-Session: https://claude.ai/code/session_01MN4gTfErSULVtFJnUJ6zoR
</commit_message>
<xml_diff>
--- a/docs/paper/Auditrix_with_UI - clean.docx
+++ b/docs/paper/Auditrix_with_UI - clean.docx
@@ -11464,7 +11464,7 @@
           <w:sz w:val="24"/>
           <w:szCs w:val="24"/>
         </w:rPr>
-        <w:t>Figure 4.7k. First Log In — password change with the rules checklist</w:t>
+        <w:t>Figure 4.7k. Create Program — new chairperson account with a temporary password</w:t>
       </w:r>
       <w:commentRangeEnd w:id="1"/>
       <w:r>
@@ -11477,6 +11477,58 @@
           <w:szCs w:val="24"/>
         </w:rPr>
         <w:commentReference w:id="1"/>
+      </w:r>
+    </w:p>
+    <w:p>
+      <w:pPr>
+        <w:spacing w:after="120" w:line="240" w:lineRule="auto"/>
+        <w:jc w:val="center"/>
+        <w:rPr>
+          <w:rFonts w:ascii="Courier New" w:hAnsi="Courier New" w:cs="Courier New"/>
+          <w:sz w:val="24"/>
+          <w:szCs w:val="24"/>
+        </w:rPr>
+      </w:pPr>
+      <w:r>
+        <w:rPr>
+          <w:noProof/>
+        </w:rPr>
+        <w:lastRenderedPageBreak/>
+        <w:drawing>
+          <wp:inline distT="0" distB="0" distL="0" distR="0" wp14:anchorId="7A8ED682" wp14:editId="54C8238D">
+            <wp:extent cx="5669280" cy="3543300"/>
+            <wp:effectExtent l="0" t="0" r="0" b="0"/>
+            <wp:docPr id="8000102" name="Figure 4.7k"/>
+            <wp:cNvGraphicFramePr>
+              <a:graphicFrameLocks xmlns:a="http://schemas.openxmlformats.org/drawingml/2006/main" noChangeAspect="1"/>
+            </wp:cNvGraphicFramePr>
+            <a:graphic xmlns:a="http://schemas.openxmlformats.org/drawingml/2006/main">
+              <a:graphicData uri="http://schemas.openxmlformats.org/drawingml/2006/picture">
+                <pic:pic xmlns:pic="http://schemas.openxmlformats.org/drawingml/2006/picture">
+                  <pic:nvPicPr>
+                    <pic:cNvPr id="8000102" name="Figure 4.7k"/>
+                    <pic:cNvPicPr/>
+                  </pic:nvPicPr>
+                  <pic:blipFill>
+                    <a:blip r:embed="rId9202"/>
+                    <a:stretch>
+                      <a:fillRect/>
+                    </a:stretch>
+                  </pic:blipFill>
+                  <pic:spPr>
+                    <a:xfrm>
+                      <a:off x="0" y="0"/>
+                      <a:ext cx="5669280" cy="3543300"/>
+                    </a:xfrm>
+                    <a:prstGeom prst="rect">
+                      <a:avLst/>
+                    </a:prstGeom>
+                  </pic:spPr>
+                </pic:pic>
+              </a:graphicData>
+            </a:graphic>
+          </wp:inline>
+        </w:drawing>
       </w:r>
     </w:p>
     <w:p>
@@ -11492,15 +11544,80 @@
           <w:szCs w:val="24"/>
         </w:rPr>
       </w:pPr>
-      <w:r>
-        <w:rPr>
-          <w:rFonts w:ascii="Courier New" w:hAnsi="Courier New" w:cs="Courier New"/>
-          <w:i/>
-          <w:iCs/>
-          <w:sz w:val="24"/>
-          <w:szCs w:val="24"/>
-        </w:rPr>
-        <w:t>[Insert screenshot: first-login password change, with the checklist partly green]</w:t>
+      <w:commentRangeStart w:id="1"/>
+      <w:r>
+        <w:rPr>
+          <w:rFonts w:ascii="Courier New" w:hAnsi="Courier New" w:cs="Courier New"/>
+          <w:b/>
+          <w:bCs/>
+          <w:sz w:val="24"/>
+          <w:szCs w:val="24"/>
+        </w:rPr>
+        <w:t>Figure 4.7l. First Log In — password change with the rules checklist</w:t>
+      </w:r>
+      <w:commentRangeEnd w:id="1"/>
+      <w:r>
+        <w:rPr>
+          <w:rStyle w:val="CommentReference"/>
+          <w:rFonts w:ascii="Courier New" w:hAnsi="Courier New" w:cs="Courier New"/>
+          <w:b/>
+          <w:bCs/>
+          <w:sz w:val="24"/>
+          <w:szCs w:val="24"/>
+        </w:rPr>
+        <w:commentReference w:id="1"/>
+      </w:r>
+    </w:p>
+    <w:p>
+      <w:pPr>
+        <w:spacing w:after="120" w:line="240" w:lineRule="auto"/>
+        <w:jc w:val="center"/>
+        <w:rPr>
+          <w:rFonts w:ascii="Courier New" w:hAnsi="Courier New" w:cs="Courier New"/>
+          <w:sz w:val="24"/>
+          <w:szCs w:val="24"/>
+        </w:rPr>
+      </w:pPr>
+      <w:r>
+        <w:rPr>
+          <w:noProof/>
+        </w:rPr>
+        <w:lastRenderedPageBreak/>
+        <w:drawing>
+          <wp:inline distT="0" distB="0" distL="0" distR="0" wp14:anchorId="7A8ED682" wp14:editId="54C8238D">
+            <wp:extent cx="5669280" cy="3543300"/>
+            <wp:effectExtent l="0" t="0" r="0" b="0"/>
+            <wp:docPr id="8000101" name="Figure 4.7l"/>
+            <wp:cNvGraphicFramePr>
+              <a:graphicFrameLocks xmlns:a="http://schemas.openxmlformats.org/drawingml/2006/main" noChangeAspect="1"/>
+            </wp:cNvGraphicFramePr>
+            <a:graphic xmlns:a="http://schemas.openxmlformats.org/drawingml/2006/main">
+              <a:graphicData uri="http://schemas.openxmlformats.org/drawingml/2006/picture">
+                <pic:pic xmlns:pic="http://schemas.openxmlformats.org/drawingml/2006/picture">
+                  <pic:nvPicPr>
+                    <pic:cNvPr id="8000101" name="Figure 4.7l"/>
+                    <pic:cNvPicPr/>
+                  </pic:nvPicPr>
+                  <pic:blipFill>
+                    <a:blip r:embed="rId9201"/>
+                    <a:stretch>
+                      <a:fillRect/>
+                    </a:stretch>
+                  </pic:blipFill>
+                  <pic:spPr>
+                    <a:xfrm>
+                      <a:off x="0" y="0"/>
+                      <a:ext cx="5669280" cy="3543300"/>
+                    </a:xfrm>
+                    <a:prstGeom prst="rect">
+                      <a:avLst/>
+                    </a:prstGeom>
+                  </pic:spPr>
+                </pic:pic>
+              </a:graphicData>
+            </a:graphic>
+          </wp:inline>
+        </w:drawing>
       </w:r>
     </w:p>
     <w:p>
@@ -11524,7 +11641,7 @@
           <w:sz w:val="24"/>
           <w:szCs w:val="24"/>
         </w:rPr>
-        <w:t>Figure 4.7l. Dean Dashboard — Current semester</w:t>
+        <w:t>Figure 4.7m. Dean Dashboard — Current semester</w:t>
       </w:r>
     </w:p>
     <w:p>
@@ -11600,7 +11717,7 @@
           <w:sz w:val="24"/>
           <w:szCs w:val="24"/>
         </w:rPr>
-        <w:t>Figure 4.7m. Chairperson Dashboard</w:t>
+        <w:t>Figure 4.7n. Chairperson Dashboard</w:t>
       </w:r>
     </w:p>
     <w:p>
@@ -11676,7 +11793,7 @@
           <w:sz w:val="24"/>
           <w:szCs w:val="24"/>
         </w:rPr>
-        <w:t>Figure 4.7n. Import Curriculum — preview of changes</w:t>
+        <w:t>Figure 4.7o. Import Curriculum — preview of changes</w:t>
       </w:r>
     </w:p>
     <w:p>
@@ -11752,7 +11869,7 @@
           <w:sz w:val="24"/>
           <w:szCs w:val="24"/>
         </w:rPr>
-        <w:t>Figure 4.7o. Grade Logbook</w:t>
+        <w:t>Figure 4.7p. Grade Logbook</w:t>
       </w:r>
     </w:p>
     <w:p>
@@ -11828,7 +11945,7 @@
           <w:sz w:val="24"/>
           <w:szCs w:val="24"/>
         </w:rPr>
-        <w:t>Figure 4.7p. Edit Student — year level (automatic or set by hand)</w:t>
+        <w:t>Figure 4.7q. Edit Student — year level (automatic or set by hand)</w:t>
       </w:r>
     </w:p>
     <w:p>

</xml_diff>

<commit_message>
Remove the abstract from the full paper
Drops the abstract page and its Table of Contents entry; the front pages
now run TOC (ii-iii), List of Tables (iv), List of Figures (v-vi).

Co-Authored-By: Claude Opus 5.5 <noreply@anthropic.com>
Claude-Session: https://claude.ai/code/session_01MN4gTfErSULVtFJnUJ6zoR
</commit_message>
<xml_diff>
--- a/docs/paper/Auditrix_with_UI - clean.docx
+++ b/docs/paper/Auditrix_with_UI - clean.docx
@@ -448,131 +448,6 @@
           <w:sz w:val="24"/>
           <w:szCs w:val="24"/>
         </w:rPr>
-        <w:t xml:space="preserve">ABSTRACT</w:t>
-      </w:r>
-      <w:r>
-        <w:fldChar w:fldCharType="begin"/>
-      </w:r>
-      <w:r>
-        <w:instrText xml:space="preserve"> TC "ABSTRACT" \f c \l 1 </w:instrText>
-      </w:r>
-      <w:r>
-        <w:fldChar w:fldCharType="end"/>
-      </w:r>
-    </w:p>
-    <w:p>
-      <w:pPr>
-        <w:spacing w:line="480" w:lineRule="auto"/>
-        <w:ind w:firstLine="720"/>
-        <w:jc w:val="both"/>
-        <w:rPr>
-          <w:rFonts w:ascii="Courier New" w:hAnsi="Courier New" w:cs="Courier New"/>
-          <w:sz w:val="24"/>
-          <w:szCs w:val="24"/>
-        </w:rPr>
-      </w:pPr>
-      <w:r>
-        <w:rPr>
-          <w:rFonts w:ascii="Courier New" w:hAnsi="Courier New" w:cs="Courier New"/>
-          <w:sz w:val="24"/>
-          <w:szCs w:val="24"/>
-        </w:rPr>
-        <w:t xml:space="preserve">Program chairpersons of Kalinga State University (KSU) check by hand whether students have met the prerequisites of the subjects they take. Interviews with the six Program Chairpersons of the College of Engineering and Information Technology (CEIT) showed that this review is done against the curriculum map within a compressed enrollment period, so violations are often discovered only at the graduation audit. This study designed and developed Auditrix: A Curriculum Audit System for KSU, a web-based system that checks every subject a student has taken against the prerequisites, co-requisites and year-standing requirements of the student's curriculum version.</w:t>
-      </w:r>
-    </w:p>
-    <w:p>
-      <w:pPr>
-        <w:spacing w:line="480" w:lineRule="auto"/>
-        <w:ind w:firstLine="720"/>
-        <w:jc w:val="both"/>
-        <w:rPr>
-          <w:rFonts w:ascii="Courier New" w:hAnsi="Courier New" w:cs="Courier New"/>
-          <w:sz w:val="24"/>
-          <w:szCs w:val="24"/>
-        </w:rPr>
-      </w:pPr>
-      <w:r>
-        <w:rPr>
-          <w:rFonts w:ascii="Courier New" w:hAnsi="Courier New" w:cs="Courier New"/>
-          <w:sz w:val="24"/>
-          <w:szCs w:val="24"/>
-        </w:rPr>
-        <w:t xml:space="preserve">The system was developed using the Iterative and Incremental Development model with Next.js, React, TypeScript, Tailwind CSS and Supabase (PostgreSQL with row-level security), and was tested with the BSCpE, BSIT and BSCE programs of the CEIT. Its audit engine compares the term in which each subject was taken with the term in which each requirement was passed, so the results do not depend on the order in which grades are encoded, and it marks each subject as Completed, Available, Pending, Unavailable or Violation, giving the reason for every violation. Following the KSU Student Handbook and Operations Manual, the system also determines each student's year level from the units passed and classifies students as regular or irregular against the prescribed load of the current semester. Other modules cover curriculum versions with import preview and export, student registration and import from KSU-MIS class lists, term-based grade entry with a grade logbook, shifts, transfers and drops, and dashboards for chairpersons and deans.</w:t>
-      </w:r>
-    </w:p>
-    <w:p>
-      <w:pPr>
-        <w:spacing w:line="480" w:lineRule="auto"/>
-        <w:ind w:firstLine="720"/>
-        <w:jc w:val="both"/>
-        <w:rPr>
-          <w:rFonts w:ascii="Courier New" w:hAnsi="Courier New" w:cs="Courier New"/>
-          <w:sz w:val="24"/>
-          <w:szCs w:val="24"/>
-        </w:rPr>
-      </w:pPr>
-      <w:r>
-        <w:rPr>
-          <w:rFonts w:ascii="Courier New" w:hAnsi="Courier New" w:cs="Courier New"/>
-          <w:sz w:val="24"/>
-          <w:szCs w:val="24"/>
-        </w:rPr>
-        <w:t xml:space="preserve">All 149 automated unit and integration tests pass, and functional testing of each feature in a web browser passed after the defects found were fixed. The evaluation of the system against the ISO/IEC 25010 software quality model is yet to be conducted.</w:t>
-      </w:r>
-    </w:p>
-    <w:p>
-      <w:pPr>
-        <w:spacing w:line="480" w:lineRule="auto"/>
-        <w:jc w:val="both"/>
-        <w:rPr>
-          <w:rFonts w:ascii="Courier New" w:hAnsi="Courier New" w:cs="Courier New"/>
-          <w:sz w:val="24"/>
-          <w:szCs w:val="24"/>
-        </w:rPr>
-      </w:pPr>
-      <w:r>
-        <w:rPr>
-          <w:rFonts w:ascii="Courier New" w:hAnsi="Courier New" w:cs="Courier New"/>
-          <w:b/>
-          <w:bCs/>
-          <w:sz w:val="24"/>
-          <w:szCs w:val="24"/>
-        </w:rPr>
-        <w:t xml:space="preserve">Keywords: </w:t>
-      </w:r>
-      <w:r>
-        <w:rPr>
-          <w:rFonts w:ascii="Courier New" w:hAnsi="Courier New" w:cs="Courier New"/>
-          <w:i/>
-          <w:iCs/>
-          <w:sz w:val="24"/>
-          <w:szCs w:val="24"/>
-        </w:rPr>
-        <w:t xml:space="preserve">curriculum audit, prerequisite checking, academic records, web-based system, ISO/IEC 25010</w:t>
-      </w:r>
-    </w:p>
-    <w:p>
-      <w:pPr>
-        <w:keepNext/>
-        <w:pageBreakBefore/>
-        <w:spacing w:after="240" w:line="480" w:lineRule="auto"/>
-        <w:jc w:val="center"/>
-        <w:rPr>
-          <w:rFonts w:ascii="Courier New" w:hAnsi="Courier New" w:cs="Courier New"/>
-          <w:b/>
-          <w:bCs/>
-          <w:sz w:val="24"/>
-          <w:szCs w:val="24"/>
-        </w:rPr>
-      </w:pPr>
-      <w:r>
-        <w:rPr>
-          <w:rFonts w:ascii="Courier New" w:hAnsi="Courier New" w:cs="Courier New"/>
-          <w:b/>
-          <w:bCs/>
-          <w:sz w:val="24"/>
-          <w:szCs w:val="24"/>
-        </w:rPr>
         <w:t xml:space="preserve">TABLE OF CONTENTS</w:t>
       </w:r>
     </w:p>
@@ -595,7 +470,7 @@
           <w:sz w:val="24"/>
           <w:szCs w:val="24"/>
         </w:rPr>
-        <w:t xml:space="preserve">ABSTRACT</w:t>
+        <w:t xml:space="preserve">LIST OF TABLES</w:t>
       </w:r>
       <w:r>
         <w:rPr>
@@ -611,7 +486,7 @@
           <w:sz w:val="24"/>
           <w:szCs w:val="24"/>
         </w:rPr>
-        <w:t xml:space="preserve">ii</w:t>
+        <w:t xml:space="preserve">iv</w:t>
       </w:r>
     </w:p>
     <w:p>
@@ -624,7 +499,7 @@
           <w:sz w:val="24"/>
           <w:szCs w:val="24"/>
         </w:rPr>
-        <w:t xml:space="preserve">LIST OF TABLES</w:t>
+        <w:t xml:space="preserve">LIST OF FIGURES</w:t>
       </w:r>
       <w:r>
         <w:rPr>
@@ -640,36 +515,7 @@
           <w:sz w:val="24"/>
           <w:szCs w:val="24"/>
         </w:rPr>
-        <w:t xml:space="preserve">vi</w:t>
-      </w:r>
-    </w:p>
-    <w:p>
-      <w:pPr>
-        <w:pStyle w:val="TOC1"/>
-      </w:pPr>
-      <w:r>
-        <w:rPr>
-          <w:rFonts w:ascii="Courier New" w:hAnsi="Courier New" w:cs="Courier New"/>
-          <w:sz w:val="24"/>
-          <w:szCs w:val="24"/>
-        </w:rPr>
-        <w:t xml:space="preserve">LIST OF FIGURES</w:t>
-      </w:r>
-      <w:r>
-        <w:rPr>
-          <w:rFonts w:ascii="Courier New" w:hAnsi="Courier New" w:cs="Courier New"/>
-          <w:sz w:val="24"/>
-          <w:szCs w:val="24"/>
-        </w:rPr>
-        <w:tab/>
-      </w:r>
-      <w:r>
-        <w:rPr>
-          <w:rFonts w:ascii="Courier New" w:hAnsi="Courier New" w:cs="Courier New"/>
-          <w:sz w:val="24"/>
-          <w:szCs w:val="24"/>
-        </w:rPr>
-        <w:t xml:space="preserve">vii</w:t>
+        <w:t xml:space="preserve">v</w:t>
       </w:r>
     </w:p>
     <w:p>

</xml_diff>